<commit_message>
Automate PDF export and harden the build script
- Resolve the 'docx' package from a local install, falling back to the
  global npm root, so the build works without NODE_PATH being set.
- Export the PDF automatically after writing the DOCX, using an isolated
  LibreOffice user profile so a running instance can't block the build.
  Fails soft with a warning if LibreOffice is unavailable.
- Refine the languages line to 'fluent, C2' for a clearer proficiency signal.
- Update README to match the simplified build workflow.
</commit_message>
<xml_diff>
--- a/Felipe_Santos_Resume_Public.docx
+++ b/Felipe_Santos_Resume_Public.docx
@@ -32,7 +32,7 @@
           <w:sz w:val="22"/>
           <w:szCs w:val="22"/>
         </w:rPr>
-        <w:t xml:space="preserve">Physical AI | Edge AI | IoT Platforms | Solutions Architect | Technical Lead | M.Sc. in AIoT &amp; Cybersecurity</w:t>
+        <w:t xml:space="preserve">Physical AI | Edge AI | AIoT Platforms | Solutions Architect · Tech Lead · Practice Lead | M.Sc. in AIoT &amp; Cybersecurity</w:t>
       </w:r>
     </w:p>
     <w:p>
@@ -48,7 +48,7 @@
         </w:rPr>
         <w:t xml:space="preserve">Belo Horizonte, Brazil (remote-first, open to global mobility &amp; travel)   |   </w:t>
       </w:r>
-      <w:hyperlink w:history="1" r:id="rIdeggbqy7u1p9fawk3i5pn4">
+      <w:hyperlink w:history="1" r:id="rIdoa1opyjcauiwfqb-kzmiz">
         <w:r>
           <w:rPr>
             <w:rFonts w:ascii="Calibri" w:cs="Calibri" w:eastAsia="Calibri" w:hAnsi="Calibri"/>
@@ -68,7 +68,7 @@
         </w:pBdr>
         <w:spacing w:after="40"/>
       </w:pPr>
-      <w:hyperlink w:history="1" r:id="rIdffwetzhi1tthxqvlztscu">
+      <w:hyperlink w:history="1" r:id="rIdulqpkhh5vkd42tkpgkjq8">
         <w:r>
           <w:rPr>
             <w:rFonts w:ascii="Calibri" w:cs="Calibri" w:eastAsia="Calibri" w:hAnsi="Calibri"/>
@@ -89,7 +89,7 @@
         </w:rPr>
         <w:t xml:space="preserve">   |   </w:t>
       </w:r>
-      <w:hyperlink w:history="1" r:id="rIducpubuxoaf8pbbmy2xknp">
+      <w:hyperlink w:history="1" r:id="rIdgi_pmacgfe4jmzmzcysis">
         <w:r>
           <w:rPr>
             <w:rFonts w:ascii="Calibri" w:cs="Calibri" w:eastAsia="Calibri" w:hAnsi="Calibri"/>
@@ -153,7 +153,7 @@
           <w:sz w:val="20"/>
           <w:szCs w:val="20"/>
         </w:rPr>
-        <w:t xml:space="preserve">. Practice Lead for Edge AI &amp; Platforms within Globant's Physical AI Studio and member of the studio management team. Proven record leading cross-functional teams of 5+ engineers across </w:t>
+        <w:t xml:space="preserve">. Practice Lead for Edge AI &amp; Platforms within a 50+ person Physical AI Studio at Globant and member of the studio management team. Proven record leading cross-functional teams of up to 8 engineers across </w:t>
       </w:r>
       <w:r>
         <w:rPr>
@@ -213,7 +213,7 @@
           <w:sz w:val="20"/>
           <w:szCs w:val="20"/>
         </w:rPr>
-        <w:t xml:space="preserve"> for record-speed delivery. Mentor, technical interviewer (gatekeeper), and multilingual communicator (EN/PT/ES).</w:t>
+        <w:t xml:space="preserve"> for record-speed delivery. Mentor to multiple engineers, technical hiring gatekeeper (10+ interviews), and multilingual communicator (EN/PT/ES).</w:t>
       </w:r>
     </w:p>
     <w:p>
@@ -333,7 +333,7 @@
           <w:sz w:val="20"/>
           <w:szCs w:val="20"/>
         </w:rPr>
-        <w:t xml:space="preserve">Solutions Architecture · Presales &amp; Technical Storytelling · Team Leadership · Stakeholder Management · Mentoring · Technical Hiring · Agentic Coding (Claude Code, Codex, OpenCode) · Spec-Driven Development · Context &amp; Token Engineering · Agent Harness Design</w:t>
+        <w:t xml:space="preserve">Solutions Architecture · Presales &amp; Technical Storytelling · Technical Roadmaps · Team Leadership · Stakeholder Management · Executive Demos · Vendor Management · Staffing Strategy · Mentoring · Technical Hiring · Agentic Coding (Claude Code, Codex, OpenCode) · Spec-Driven Development · Context &amp; Token Engineering · Agent Harness Design</w:t>
       </w:r>
     </w:p>
     <w:p>
@@ -372,7 +372,7 @@
           <w:sz w:val="21"/>
           <w:szCs w:val="21"/>
         </w:rPr>
-        <w:t xml:space="preserve">GLOBANT — Technology Consultant | Tech Lead · Solutions Architect · Practice Lead</w:t>
+        <w:t xml:space="preserve">GLOBANT — Tech Lead · Solutions Architect · Practice Lead</w:t>
       </w:r>
       <w:r>
         <w:rPr>
@@ -397,7 +397,7 @@
           <w:sz w:val="19"/>
           <w:szCs w:val="19"/>
         </w:rPr>
-        <w:t xml:space="preserve">Physical AI Studio — Edge AI, AIoT, computer vision, and robotics solutions for aviation, sports &amp; entertainment, smart venues, utilities, and manufacturing.</w:t>
+        <w:t xml:space="preserve">Physical AI Studio (official title: Technology Consultant) — Edge AI, AIoT, computer vision, and robotics solutions for aviation, sports &amp; entertainment, smart venues, utilities, and manufacturing.</w:t>
       </w:r>
     </w:p>
     <w:p>
@@ -457,7 +457,27 @@
           <w:sz w:val="20"/>
           <w:szCs w:val="20"/>
         </w:rPr>
-        <w:t xml:space="preserve"> verticals; contributor to Robotics and Embedded practices within the Physical AI Studio.</w:t>
+        <w:t xml:space="preserve"> verticals within a </w:t>
+      </w:r>
+      <w:r>
+        <w:rPr>
+          <w:rFonts w:ascii="Calibri" w:cs="Calibri" w:eastAsia="Calibri" w:hAnsi="Calibri"/>
+          <w:b/>
+          <w:bCs/>
+          <w:color w:val="212121"/>
+          <w:sz w:val="20"/>
+          <w:szCs w:val="20"/>
+        </w:rPr>
+        <w:t xml:space="preserve">50+ person Physical AI Studio</w:t>
+      </w:r>
+      <w:r>
+        <w:rPr>
+          <w:rFonts w:ascii="Calibri" w:cs="Calibri" w:eastAsia="Calibri" w:hAnsi="Calibri"/>
+          <w:color w:val="212121"/>
+          <w:sz w:val="20"/>
+          <w:szCs w:val="20"/>
+        </w:rPr>
+        <w:t xml:space="preserve">; contributor to Robotics and Embedded practices.</w:t>
       </w:r>
     </w:p>
     <w:p>
@@ -573,7 +593,27 @@
           <w:sz w:val="20"/>
           <w:szCs w:val="20"/>
         </w:rPr>
-        <w:t xml:space="preserve">Mentor to multiple engineers and hiring gatekeeper conducting technical interviews for staffing candidates.</w:t>
+        <w:t xml:space="preserve">Mentor to multiple engineers and studio hiring gatekeeper: </w:t>
+      </w:r>
+      <w:r>
+        <w:rPr>
+          <w:rFonts w:ascii="Calibri" w:cs="Calibri" w:eastAsia="Calibri" w:hAnsi="Calibri"/>
+          <w:b/>
+          <w:bCs/>
+          <w:color w:val="212121"/>
+          <w:sz w:val="20"/>
+          <w:szCs w:val="20"/>
+        </w:rPr>
+        <w:t xml:space="preserve">10+ technical interviews</w:t>
+      </w:r>
+      <w:r>
+        <w:rPr>
+          <w:rFonts w:ascii="Calibri" w:cs="Calibri" w:eastAsia="Calibri" w:hAnsi="Calibri"/>
+          <w:color w:val="212121"/>
+          <w:sz w:val="20"/>
+          <w:szCs w:val="20"/>
+        </w:rPr>
+        <w:t xml:space="preserve"> for staffing candidates.</w:t>
       </w:r>
     </w:p>
     <w:p>
@@ -1549,7 +1589,7 @@
         </w:rPr>
         <w:t xml:space="preserve">: </w:t>
       </w:r>
-      <w:hyperlink w:history="1" r:id="rIdjbkrmnbnevxnuxd_qglkx">
+      <w:hyperlink w:history="1" r:id="rIdkv0jwhjj1qvflby6qbtux">
         <w:r>
           <w:rPr>
             <w:rFonts w:ascii="Calibri" w:cs="Calibri" w:eastAsia="Calibri" w:hAnsi="Calibri"/>
@@ -1647,7 +1687,7 @@
         </w:rPr>
         <w:t xml:space="preserve"> (IEEE, IOP): </w:t>
       </w:r>
-      <w:hyperlink w:history="1" r:id="rIdnu_ergh6thsw4ddktgxuv">
+      <w:hyperlink w:history="1" r:id="rIdyfqxmciyrqhkkdak-eulv">
         <w:r>
           <w:rPr>
             <w:rFonts w:ascii="Calibri" w:cs="Calibri" w:eastAsia="Calibri" w:hAnsi="Calibri"/>
@@ -1668,7 +1708,7 @@
         </w:rPr>
         <w:t xml:space="preserve">  ·  </w:t>
       </w:r>
-      <w:hyperlink w:history="1" r:id="rIdjzxixamimbrfx1pnn84h4">
+      <w:hyperlink w:history="1" r:id="rIdrgjje9ysgwhaegbk5fl9h">
         <w:r>
           <w:rPr>
             <w:rFonts w:ascii="Calibri" w:cs="Calibri" w:eastAsia="Calibri" w:hAnsi="Calibri"/>
@@ -1689,7 +1729,7 @@
         </w:rPr>
         <w:t xml:space="preserve">  ·  </w:t>
       </w:r>
-      <w:hyperlink w:history="1" r:id="rIdgheuuirrzej1bfmddxu6k">
+      <w:hyperlink w:history="1" r:id="rIdfjtezyez3rumy14kxuegx">
         <w:r>
           <w:rPr>
             <w:rFonts w:ascii="Calibri" w:cs="Calibri" w:eastAsia="Calibri" w:hAnsi="Calibri"/>
@@ -1783,7 +1823,7 @@
           <w:sz w:val="20"/>
           <w:szCs w:val="20"/>
         </w:rPr>
-        <w:t xml:space="preserve">Portuguese (native)  ·  English (full professional)  ·  Spanish (full professional)</w:t>
+        <w:t xml:space="preserve">Portuguese (native)  ·  English (fluent, C2)  ·  Spanish (fluent, C2)</w:t>
       </w:r>
     </w:p>
     <w:sectPr>

</xml_diff>